<commit_message>
docs(event-contracts): confirm settle→redeem in retest matrix
The retest market finalized (Down won) and the winning side redeemed 1:1,
completing the faucet→mint→maker→taker→settle→redeem lifecycle. Row 13 marked
passing in the README and docx with the redeem transaction.
</commit_message>
<xml_diff>
--- a/event-contracts/DreamDEX-Event-Contracts-Report.docx
+++ b/event-contracts/DreamDEX-Event-Contracts-Report.docx
@@ -1896,11 +1896,11 @@
                 <w:rFonts w:ascii="Calibri" w:cs="Calibri" w:eastAsia="Calibri" w:hAnsi="Calibri"/>
                 <w:b/>
                 <w:bCs/>
-                <w:color w:val="B25E09"/>
+                <w:color w:val="0B7A46"/>
                 <w:sz w:val="18"/>
                 <w:szCs w:val="18"/>
               </w:rPr>
-              <w:t xml:space="preserve">⏳ Pending</w:t>
+              <w:t xml:space="preserve">✔ Yes</w:t>
             </w:r>
           </w:p>
         </w:tc>
@@ -1925,7 +1925,7 @@
                 <w:sz w:val="15"/>
                 <w:szCs w:val="15"/>
               </w:rPr>
-              <w:t xml:space="preserve">market settling</w:t>
+              <w:t xml:space="preserve">Down won; 10→10 USDC 0xbfd0c9…</w:t>
             </w:r>
           </w:p>
         </w:tc>
@@ -3578,6 +3578,18 @@
           <w:szCs w:val="15"/>
         </w:rPr>
         <w:t xml:space="preserve">taker fill (BUY Up, 2) 0x9e5f9c286247af357ae8928e63bf8ca8f980285555ecf4cdba12f0472d1120b9</w:t>
+      </w:r>
+      <w:r>
+        <w:br/>
+      </w:r>
+      <w:r>
+        <w:rPr>
+          <w:rFonts w:ascii="Consolas" w:cs="Consolas" w:eastAsia="Consolas" w:hAnsi="Consolas"/>
+          <w:color w:val="3A3A50"/>
+          <w:sz w:val="15"/>
+          <w:szCs w:val="15"/>
+        </w:rPr>
+        <w:t xml:space="preserve">settle → redeem       0xbfd0c93c44bef14b36657e7194ada9225befc2b58d9e307561f257fa3d0a8c24  (Down won, 10→10 USDC)</w:t>
       </w:r>
     </w:p>
     <w:p>

</xml_diff>